<commit_message>
Merge evaluation framework: add rubric table, phased approach, clarity dimension, and remediation loop
Made-with: Cursor
</commit_message>
<xml_diff>
--- a/PRD.docx
+++ b/PRD.docx
@@ -714,7 +714,12 @@
         <w:pStyle w:val="Heading1"/>
       </w:pPr>
       <w:r>
-        <w:t>6. Success Metrics &amp; Evaluation Framework</w:t>
+        <w:t>6. Success Metrics and Evaluation Framework</w:t>
+      </w:r>
+    </w:p>
+    <w:p>
+      <w:r>
+        <w:t>The success of this system will be measured using both operational efficiency metrics and AI output quality metrics. A structured evaluation rubric and phased approach will be used to continuously assess and improve the quality of generated updates.</w:t>
       </w:r>
     </w:p>
     <w:p>
@@ -726,11 +731,8 @@
       </w:r>
     </w:p>
     <w:p>
-      <w:pPr>
-        <w:pStyle w:val="ListBullet"/>
-      </w:pPr>
       <w:r>
-        <w:t>**Time to first draft:** From “Generate” click to draft displayed. Target: &amp;lt; 60 seconds for Crawl.</w:t>
+        <w:t>These metrics measure whether the system meaningfully improves incident communication speed.</w:t>
       </w:r>
     </w:p>
     <w:p>
@@ -738,7 +740,7 @@
         <w:pStyle w:val="ListBullet"/>
       </w:pPr>
       <w:r>
-        <w:t>**Time to published update:** From incident acknowledge to first status page update. Target: reduction of 30%+ vs baseline (manual drafting).</w:t>
+        <w:t>**Time to first draft:** Time between an incident commander requesting an update and the system generating a draft. Target: under 60 seconds.</w:t>
       </w:r>
     </w:p>
     <w:p>
@@ -746,7 +748,23 @@
         <w:pStyle w:val="ListBullet"/>
       </w:pPr>
       <w:r>
-        <w:t>**Edit rate:** % of drafts published with no or minimal edits. Track to improve prompts and RAG.</w:t>
+        <w:t>**Time to first customer update:** Time from incident acknowledgment to the first status page update. Target: reduce by at least 30% compared with the current manual drafting process.</w:t>
+      </w:r>
+    </w:p>
+    <w:p>
+      <w:pPr>
+        <w:pStyle w:val="ListBullet"/>
+      </w:pPr>
+      <w:r>
+        <w:t>**Edit rate:** Percentage of generated drafts that require only minimal edits before publishing. Lower edit rates indicate higher draft quality. Target: 70%+ "published as-is" in Run.</w:t>
+      </w:r>
+    </w:p>
+    <w:p>
+      <w:pPr>
+        <w:pStyle w:val="ListBullet"/>
+      </w:pPr>
+      <w:r>
+        <w:t>**Commander satisfaction:** Periodic survey (e.g. quarterly) of incident commanders and Technical Support rating draft quality on a 1–5 scale. Tracks whether the tool is genuinely useful under pressure.</w:t>
       </w:r>
     </w:p>
     <w:p>
@@ -754,7 +772,12 @@
         <w:pStyle w:val="Heading2"/>
       </w:pPr>
       <w:r>
-        <w:t>6.2 AI Output Quality</w:t>
+        <w:t>6.2 AI Output Quality Metrics</w:t>
+      </w:r>
+    </w:p>
+    <w:p>
+      <w:r>
+        <w:t>These metrics measure the usefulness and reliability of generated drafts.</w:t>
       </w:r>
     </w:p>
     <w:p>
@@ -762,7 +785,7 @@
         <w:pStyle w:val="ListBullet"/>
       </w:pPr>
       <w:r>
-        <w:t>**Format compliance:** Draft includes Title, Status, Message and matches the structure in `status_page_examples.md`. Automated check on schema.</w:t>
+        <w:t>**Format compliance:** Generated updates consistently follow the required structure (Title, Status, Message) and match the organization's status page format.</w:t>
       </w:r>
     </w:p>
     <w:p>
@@ -770,7 +793,7 @@
         <w:pStyle w:val="ListBullet"/>
       </w:pPr>
       <w:r>
-        <w:t>**Tone and safety:** No internal-only terms (e.g. “connection pool,” “PR #12345,” “rds-prod-main”). Human review checklist; optionally LLM or keyword-based guardrail.</w:t>
+        <w:t>**Message safety:** Drafts must avoid exposing internal technical details (e.g. infrastructure names, internal tickets, PR numbers, or code references).</w:t>
       </w:r>
     </w:p>
     <w:p>
@@ -778,7 +801,7 @@
         <w:pStyle w:val="ListBullet"/>
       </w:pPr>
       <w:r>
-        <w:t>**Accuracy:** Stated timeline and impact align with underlying data (e.g. start/end time, “API slower” vs metrics). Spot-check or sample review.</w:t>
+        <w:t>**Accuracy:** Customer impact descriptions and incident timelines must align with underlying incident data (e.g. start/end time, "API slower" vs metrics).</w:t>
       </w:r>
     </w:p>
     <w:p>
@@ -786,7 +809,7 @@
         <w:pStyle w:val="ListBullet"/>
       </w:pPr>
       <w:r>
-        <w:t>**Source attribution:** Draft is traceable to ingested sources; at minimum a “Sources used” list is shown. No unsupported factual claims; commander can verify and correct.</w:t>
+        <w:t>**Customer impact clarity:** Updates clearly describe how customers are affected (e.g. "slower API responses," "intermittent errors") rather than internal technical symptoms.</w:t>
       </w:r>
     </w:p>
     <w:p>
@@ -794,7 +817,15 @@
         <w:pStyle w:val="ListBullet"/>
       </w:pPr>
       <w:r>
-        <w:t>**Consistency:** Same incident + update type produces similar tone and structure across runs; compare multiple generations for the same inputs.</w:t>
+        <w:t>**Source attribution:** Draft is traceable to ingested sources; a "Sources used" list is shown so the commander can verify and correct.</w:t>
+      </w:r>
+    </w:p>
+    <w:p>
+      <w:pPr>
+        <w:pStyle w:val="ListBullet"/>
+      </w:pPr>
+      <w:r>
+        <w:t>**Consistency:** Same incident and status type produces similar tone and structure across runs.</w:t>
       </w:r>
     </w:p>
     <w:p>
@@ -802,23 +833,105 @@
         <w:pStyle w:val="Heading2"/>
       </w:pPr>
       <w:r>
-        <w:t>6.3 Evaluation Approach</w:t>
+        <w:t>6.3 Evaluation Rubric</w:t>
+      </w:r>
+    </w:p>
+    <w:p>
+      <w:r>
+        <w:t>Every draft should be scored against the following dimensions. Incident commanders or Technical Support (not the development team) perform the review to avoid self-assessment bias.</w:t>
+      </w:r>
+    </w:p>
+    <w:p>
+      <w:r>
+        <w:t>| Dimension | What to check | Pass criteria |</w:t>
+      </w:r>
+    </w:p>
+    <w:p>
+      <w:r>
+        <w:t>|-----------|--------------|---------------|</w:t>
+      </w:r>
+    </w:p>
+    <w:p>
+      <w:r>
+        <w:t>| **Format** | Has Title, Status, Message; Status is one of the four valid values | All three fields present; Status is valid |</w:t>
+      </w:r>
+    </w:p>
+    <w:p>
+      <w:r>
+        <w:t>| **Tone** | Professional, empathetic, customer-focused; no internal jargon | No internal system names, PR numbers, or technical metrics in Message |</w:t>
+      </w:r>
+    </w:p>
+    <w:p>
+      <w:r>
+        <w:t>| **Accuracy** | Timeline (start/end), duration, and impact match the underlying data | Times correct to within ±5 min; impact aligns with metrics |</w:t>
+      </w:r>
+    </w:p>
+    <w:p>
+      <w:r>
+        <w:t>| **Completeness** | Message covers what happened, what was affected, and resolution/next steps | All three elements present for Resolved; at least first two for other statuses |</w:t>
+      </w:r>
+    </w:p>
+    <w:p>
+      <w:r>
+        <w:t>| **Safety** | No PII, no unconfirmed speculation, no blame | Zero violations |</w:t>
+      </w:r>
+    </w:p>
+    <w:p>
+      <w:r>
+        <w:t>| **Clarity** | Understandable by a non-technical customer | No unexplained acronyms or implied technical knowledge required |</w:t>
+      </w:r>
+    </w:p>
+    <w:p>
+      <w:r>
+        <w:t>| **Brevity** | Concise; no unnecessary repetition | Resolved under ~150 words; Investigating/Identified under ~80 words |</w:t>
       </w:r>
     </w:p>
     <w:p>
       <w:pPr>
-        <w:pStyle w:val="ListBullet"/>
+        <w:pStyle w:val="Heading2"/>
       </w:pPr>
       <w:r>
-        <w:t>**Crawl:** Manual review of 10–20 drafts (different incidents/update types) against a rubric (format, tone, no internal leak, accuracy). Iterate on prompt and RAG.</w:t>
+        <w:t>6.4 Evaluation Approach</w:t>
       </w:r>
     </w:p>
     <w:p>
-      <w:pPr>
-        <w:pStyle w:val="ListBullet"/>
-      </w:pPr>
       <w:r>
-        <w:t>**Walk/Run:** Add automated format checks; periodic human sampling; track edit rate and time-to-publish. Optionally collect “approved as-is” vs “edited” to fine-tune or select models.</w:t>
+        <w:t>AI output quality will be evaluated using a combination of automated checks and human review, evolving across phases.</w:t>
+      </w:r>
+    </w:p>
+    <w:p>
+      <w:r>
+        <w:t>**Crawl — Manual baseline**</w:t>
+      </w:r>
+    </w:p>
+    <w:p>
+      <w:r>
+        <w:t>Manually review 10–20 drafts (across all four status types) against the rubric above. Reviewers score each dimension pass/fail. Identify common failure modes such as incorrect timelines, missing customer impact, or tone inconsistencies. Iterate on prompts and RAG guidelines until &gt;= 80% pass rate across all dimensions.</w:t>
+      </w:r>
+    </w:p>
+    <w:p>
+      <w:r>
+        <w:t>**Walk — Automated checks and sampling**</w:t>
+      </w:r>
+    </w:p>
+    <w:p>
+      <w:r>
+        <w:t>Add automated checks for Format (schema validation) and Safety (keyword blocklist for internal terms). Run human sampling on 5–10% of published drafts. Track edit rate and time-to-publish per incident. Introduce a four-point publishing rating: "published as-is," "minor edits," "major edits," or "rejected." Use this signal to identify patterns in draft failures.</w:t>
+      </w:r>
+    </w:p>
+    <w:p>
+      <w:r>
+        <w:t>**Run — Continuous improvement**</w:t>
+      </w:r>
+    </w:p>
+    <w:p>
+      <w:r>
+        <w:t>Use "published as-is" vs "edited/rejected" signals to identify prompt or retrieval weaknesses. A/B test prompt variants or RAG chunk strategies. Optionally introduce an LLM-as-judge to score tone and accuracy at scale, reducing reliance on human sampling for large volumes. Set and monitor SLA targets (e.g. 70%+ "published as-is," time-to-first-draft under 60 seconds).</w:t>
+      </w:r>
+    </w:p>
+    <w:p>
+      <w:r>
+        <w:t>When a failure pattern is identified at any phase, the remediation path is: fix prompt or RAG, re-evaluate the same batch of drafts, and confirm improvement before re-deploying.</w:t>
       </w:r>
     </w:p>
     <w:p>

</xml_diff>